<commit_message>
Inprovements for anomaly detection section
</commit_message>
<xml_diff>
--- a/.notes/Improvements for the dae.docx
+++ b/.notes/Improvements for the dae.docx
@@ -3,11 +3,6 @@
 <w:document xmlns:wpc="http://schemas.microsoft.com/office/word/2010/wordprocessingCanvas" xmlns:cx="http://schemas.microsoft.com/office/drawing/2014/chartex" xmlns:cx1="http://schemas.microsoft.com/office/drawing/2015/9/8/chartex" xmlns:cx2="http://schemas.microsoft.com/office/drawing/2015/10/21/chartex" xmlns:cx3="http://schemas.microsoft.com/office/drawing/2016/5/9/chartex" xmlns:cx4="http://schemas.microsoft.com/office/drawing/2016/5/10/chartex" xmlns:cx5="http://schemas.microsoft.com/office/drawing/2016/5/11/chartex" xmlns:cx6="http://schemas.microsoft.com/office/drawing/2016/5/12/chartex" xmlns:cx7="http://schemas.microsoft.com/office/drawing/2016/5/13/chartex" xmlns:cx8="http://schemas.microsoft.com/office/drawing/2016/5/14/chartex" xmlns:mc="http://schemas.openxmlformats.org/markup-compatibility/2006" xmlns:aink="http://schemas.microsoft.com/office/drawing/2016/ink" xmlns:am3d="http://schemas.microsoft.com/office/drawing/2017/model3d" xmlns:o="urn:schemas-microsoft-com:office:office" xmlns:oel="http://schemas.microsoft.com/office/2019/extlst" xmlns:r="http://schemas.openxmlformats.org/officeDocument/2006/relationships" xmlns:m="http://schemas.openxmlformats.org/officeDocument/2006/math" xmlns:v="urn:schemas-microsoft-com:vml" xmlns:wp14="http://schemas.microsoft.com/office/word/2010/wordprocessingDrawing" xmlns:wp="http://schemas.openxmlformats.org/drawingml/2006/wordprocessingDrawing" xmlns:w10="urn:schemas-microsoft-com:office:word" xmlns:w="http://schemas.openxmlformats.org/wordprocessingml/2006/main" xmlns:w14="http://schemas.microsoft.com/office/word/2010/wordml" xmlns:w15="http://schemas.microsoft.com/office/word/2012/wordml" xmlns:w16cex="http://schemas.microsoft.com/office/word/2018/wordml/cex" xmlns:w16cid="http://schemas.microsoft.com/office/word/2016/wordml/cid" xmlns:w16="http://schemas.microsoft.com/office/word/2018/wordml" xmlns:w16du="http://schemas.microsoft.com/office/word/2023/wordml/word16du" xmlns:w16sdtdh="http://schemas.microsoft.com/office/word/2020/wordml/sdtdatahash" xmlns:w16sdtfl="http://schemas.microsoft.com/office/word/2024/wordml/sdtformatlock" xmlns:w16se="http://schemas.microsoft.com/office/word/2015/wordml/symex" xmlns:wpg="http://schemas.microsoft.com/office/word/2010/wordprocessingGroup" xmlns:wpi="http://schemas.microsoft.com/office/word/2010/wordprocessingInk" xmlns:wne="http://schemas.microsoft.com/office/word/2006/wordml" xmlns:wps="http://schemas.microsoft.com/office/word/2010/wordprocessingShape" mc:Ignorable="w14 w15 w16se w16cid w16 w16cex w16sdtdh w16sdtfl w16du wp14">
   <w:body>
     <w:p>
-      <w:pPr>
-        <w:rPr>
-          <w:rFonts w:hint="eastAsia"/>
-        </w:rPr>
-      </w:pPr>
       <w:r>
         <w:rPr>
           <w:rFonts w:hint="eastAsia"/>
@@ -22,13 +17,20 @@
           <w:ilvl w:val="0"/>
           <w:numId w:val="1"/>
         </w:numPr>
-      </w:pPr>
-      <w:r>
+        <w:rPr>
+          <w:highlight w:val="green"/>
+        </w:rPr>
+      </w:pPr>
+      <w:r>
+        <w:rPr>
+          <w:highlight w:val="green"/>
+        </w:rPr>
         <w:t>Try</w:t>
       </w:r>
       <w:r>
         <w:rPr>
           <w:rFonts w:hint="eastAsia"/>
+          <w:highlight w:val="green"/>
         </w:rPr>
         <w:t xml:space="preserve"> another loss function: MAE + SSIM.</w:t>
       </w:r>
@@ -62,13 +64,17 @@
           <w:numId w:val="1"/>
         </w:numPr>
       </w:pPr>
-      <w:proofErr w:type="gramStart"/>
-      <w:r>
-        <w:t>So</w:t>
-      </w:r>
-      <w:proofErr w:type="gramEnd"/>
-      <w:r>
-        <w:t xml:space="preserve"> the padding has less weight on the loss</w:t>
+      <w:r>
+        <w:t xml:space="preserve">This makes </w:t>
+      </w:r>
+      <w:r>
+        <w:t xml:space="preserve">the padding </w:t>
+      </w:r>
+      <w:r>
+        <w:t xml:space="preserve">to have </w:t>
+      </w:r>
+      <w:r>
+        <w:t>less weight on the loss</w:t>
       </w:r>
       <w:r>
         <w:rPr>
@@ -150,9 +156,6 @@
           <w:ilvl w:val="0"/>
           <w:numId w:val="1"/>
         </w:numPr>
-        <w:rPr>
-          <w:rFonts w:hint="eastAsia"/>
-        </w:rPr>
       </w:pPr>
       <w:r>
         <w:t>Enhance</w:t>
@@ -180,24 +183,16 @@
           <w:ilvl w:val="0"/>
           <w:numId w:val="1"/>
         </w:numPr>
-      </w:pPr>
-      <w:r>
-        <w:rPr>
-          <w:rFonts w:hint="eastAsia"/>
-        </w:rPr>
-        <w:t xml:space="preserve">Increase the available data and </w:t>
-      </w:r>
-      <w:r>
-        <w:rPr>
-          <w:rFonts w:hint="eastAsia"/>
-        </w:rPr>
-        <w:t>manually</w:t>
-      </w:r>
-      <w:r>
-        <w:rPr>
-          <w:rFonts w:hint="eastAsia"/>
-        </w:rPr>
-        <w:t xml:space="preserve"> filter the images that do not contribute.</w:t>
+        <w:rPr>
+          <w:highlight w:val="green"/>
+        </w:rPr>
+      </w:pPr>
+      <w:r>
+        <w:rPr>
+          <w:rFonts w:hint="eastAsia"/>
+          <w:highlight w:val="green"/>
+        </w:rPr>
+        <w:t>Increase the available data and manually filter the images that do not contribute.</w:t>
       </w:r>
     </w:p>
     <w:p>
@@ -207,8 +202,14 @@
           <w:ilvl w:val="1"/>
           <w:numId w:val="1"/>
         </w:numPr>
-      </w:pPr>
-      <w:r>
+        <w:rPr>
+          <w:highlight w:val="green"/>
+        </w:rPr>
+      </w:pPr>
+      <w:r>
+        <w:rPr>
+          <w:highlight w:val="green"/>
+        </w:rPr>
         <w:t>More clean images</w:t>
       </w:r>
     </w:p>
@@ -220,10 +221,13 @@
           <w:numId w:val="1"/>
         </w:numPr>
         <w:rPr>
-          <w:rFonts w:hint="eastAsia"/>
-        </w:rPr>
-      </w:pPr>
-      <w:r>
+          <w:highlight w:val="green"/>
+        </w:rPr>
+      </w:pPr>
+      <w:r>
+        <w:rPr>
+          <w:highlight w:val="green"/>
+        </w:rPr>
         <w:t>Remove images with little information</w:t>
       </w:r>
     </w:p>
@@ -236,7 +240,31 @@
         </w:numPr>
       </w:pPr>
       <w:r>
-        <w:t>Try different size inputs</w:t>
+        <w:t>Adjust the model</w:t>
+      </w:r>
+      <w:r>
+        <w:rPr>
+          <w:rFonts w:hint="eastAsia"/>
+        </w:rPr>
+        <w:t xml:space="preserve"> (</w:t>
+      </w:r>
+      <w:r>
+        <w:rPr>
+          <w:rFonts w:hint="eastAsia"/>
+        </w:rPr>
+        <w:t xml:space="preserve">worsen </w:t>
+      </w:r>
+      <w:r>
+        <w:t>models’</w:t>
+      </w:r>
+      <w:r>
+        <w:rPr>
+          <w:rFonts w:hint="eastAsia"/>
+        </w:rPr>
+        <w:t xml:space="preserve"> capacity)</w:t>
+      </w:r>
+      <w:r>
+        <w:t>:</w:t>
       </w:r>
     </w:p>
     <w:p>
@@ -248,7 +276,43 @@
         </w:numPr>
       </w:pPr>
       <w:r>
-        <w:t>Less resolution might help to not learn the defects</w:t>
+        <w:rPr>
+          <w:rFonts w:hint="eastAsia"/>
+        </w:rPr>
+        <w:t>Smaller bottleneck</w:t>
+      </w:r>
+    </w:p>
+    <w:p>
+      <w:pPr>
+        <w:pStyle w:val="ListParagraph"/>
+        <w:numPr>
+          <w:ilvl w:val="1"/>
+          <w:numId w:val="1"/>
+        </w:numPr>
+      </w:pPr>
+      <w:r>
+        <w:rPr>
+          <w:rFonts w:hint="eastAsia"/>
+        </w:rPr>
+        <w:t>Less filters</w:t>
+      </w:r>
+    </w:p>
+    <w:p>
+      <w:pPr>
+        <w:pStyle w:val="ListParagraph"/>
+        <w:numPr>
+          <w:ilvl w:val="1"/>
+          <w:numId w:val="1"/>
+        </w:numPr>
+      </w:pPr>
+      <w:r>
+        <w:t>M</w:t>
+      </w:r>
+      <w:r>
+        <w:rPr>
+          <w:rFonts w:hint="eastAsia"/>
+        </w:rPr>
+        <w:t>ore regularization</w:t>
       </w:r>
     </w:p>
     <w:p>
@@ -260,36 +324,10 @@
         </w:numPr>
       </w:pPr>
       <w:r>
-        <w:t>Adjust the model</w:t>
-      </w:r>
-      <w:r>
-        <w:rPr>
-          <w:rFonts w:hint="eastAsia"/>
-        </w:rPr>
-        <w:t xml:space="preserve"> (</w:t>
-      </w:r>
-      <w:r>
-        <w:rPr>
-          <w:rFonts w:hint="eastAsia"/>
-        </w:rPr>
-        <w:t xml:space="preserve">worsen </w:t>
-      </w:r>
-      <w:proofErr w:type="gramStart"/>
-      <w:r>
-        <w:rPr>
-          <w:rFonts w:hint="eastAsia"/>
-        </w:rPr>
-        <w:t>models</w:t>
-      </w:r>
-      <w:proofErr w:type="gramEnd"/>
-      <w:r>
-        <w:rPr>
-          <w:rFonts w:hint="eastAsia"/>
-        </w:rPr>
-        <w:t xml:space="preserve"> capacity)</w:t>
-      </w:r>
-      <w:r>
-        <w:t>:</w:t>
+        <w:rPr>
+          <w:rFonts w:hint="eastAsia"/>
+        </w:rPr>
+        <w:t>Data augmentation:</w:t>
       </w:r>
     </w:p>
     <w:p>
@@ -301,10 +339,13 @@
         </w:numPr>
       </w:pPr>
       <w:r>
-        <w:rPr>
-          <w:rFonts w:hint="eastAsia"/>
-        </w:rPr>
-        <w:t>Smaller bottleneck</w:t>
+        <w:t>F</w:t>
+      </w:r>
+      <w:r>
+        <w:rPr>
+          <w:rFonts w:hint="eastAsia"/>
+        </w:rPr>
+        <w:t>lips</w:t>
       </w:r>
     </w:p>
     <w:p>
@@ -316,10 +357,13 @@
         </w:numPr>
       </w:pPr>
       <w:r>
-        <w:rPr>
-          <w:rFonts w:hint="eastAsia"/>
-        </w:rPr>
-        <w:t>Less filters</w:t>
+        <w:t>S</w:t>
+      </w:r>
+      <w:r>
+        <w:rPr>
+          <w:rFonts w:hint="eastAsia"/>
+        </w:rPr>
+        <w:t>mall rotations</w:t>
       </w:r>
     </w:p>
     <w:p>
@@ -337,7 +381,7 @@
         <w:rPr>
           <w:rFonts w:hint="eastAsia"/>
         </w:rPr>
-        <w:t>ore regularization</w:t>
+        <w:t>ild shifts</w:t>
       </w:r>
     </w:p>
     <w:p>
@@ -349,10 +393,7 @@
         </w:numPr>
       </w:pPr>
       <w:r>
-        <w:rPr>
-          <w:rFonts w:hint="eastAsia"/>
-        </w:rPr>
-        <w:t>Data augmentation:</w:t>
+        <w:t>Try different size inputs</w:t>
       </w:r>
     </w:p>
     <w:p>
@@ -364,13 +405,108 @@
         </w:numPr>
       </w:pPr>
       <w:r>
-        <w:t>F</w:t>
-      </w:r>
-      <w:r>
-        <w:rPr>
-          <w:rFonts w:hint="eastAsia"/>
-        </w:rPr>
-        <w:t>lips</w:t>
+        <w:t>Less resolution might help to not learn the defects</w:t>
+      </w:r>
+    </w:p>
+    <w:p>
+      <w:r>
+        <w:br w:type="page"/>
+      </w:r>
+    </w:p>
+    <w:p>
+      <w:pPr>
+        <w:rPr>
+          <w:sz w:val="30"/>
+          <w:szCs w:val="30"/>
+        </w:rPr>
+      </w:pPr>
+      <w:r>
+        <w:rPr>
+          <w:sz w:val="30"/>
+          <w:szCs w:val="30"/>
+        </w:rPr>
+        <w:lastRenderedPageBreak/>
+        <w:t>Improvements for the anomaly detection section</w:t>
+      </w:r>
+    </w:p>
+    <w:p>
+      <w:pPr>
+        <w:pStyle w:val="ListParagraph"/>
+        <w:numPr>
+          <w:ilvl w:val="0"/>
+          <w:numId w:val="3"/>
+        </w:numPr>
+      </w:pPr>
+      <w:r>
+        <w:t>Mask over object for loss:</w:t>
+      </w:r>
+    </w:p>
+    <w:p>
+      <w:r>
+        <w:t>Use the bounding boxes of the segmentation part, since everything marked out of the box corresponds to the padding. Given that, the weight of the pixels outside the bounding box (the padding) could be set to 0. This means that the model won’</w:t>
+      </w:r>
+      <w:r>
+        <w:rPr>
+          <w:rFonts w:hint="eastAsia"/>
+        </w:rPr>
+        <w:t>t</w:t>
+      </w:r>
+      <w:r>
+        <w:t xml:space="preserve"> care at </w:t>
+      </w:r>
+      <w:proofErr w:type="gramStart"/>
+      <w:r>
+        <w:t>all of</w:t>
+      </w:r>
+      <w:proofErr w:type="gramEnd"/>
+      <w:r>
+        <w:t xml:space="preserve"> the area outside the bounding box, thus</w:t>
+      </w:r>
+      <w:r>
+        <w:t xml:space="preserve"> </w:t>
+      </w:r>
+      <w:r>
+        <w:t>the same bounding box should be used when evaluating the anomaly maps, to ignore differences outside the bounding box.</w:t>
+      </w:r>
+    </w:p>
+    <w:p>
+      <w:pPr>
+        <w:pStyle w:val="ListParagraph"/>
+        <w:numPr>
+          <w:ilvl w:val="0"/>
+          <w:numId w:val="3"/>
+        </w:numPr>
+      </w:pPr>
+      <w:r>
+        <w:t>Increase the closing/dilatation of the binary anomaly map.</w:t>
+      </w:r>
+    </w:p>
+    <w:p>
+      <w:pPr>
+        <w:pStyle w:val="ListParagraph"/>
+        <w:numPr>
+          <w:ilvl w:val="0"/>
+          <w:numId w:val="3"/>
+        </w:numPr>
+        <w:spacing w:line="480" w:lineRule="auto"/>
+      </w:pPr>
+      <w:r>
+        <w:t>Add a small dilatation to the boxes surrounding the anomalies</w:t>
+      </w:r>
+      <w:r>
+        <w:t>.</w:t>
+      </w:r>
+    </w:p>
+    <w:p>
+      <w:pPr>
+        <w:pStyle w:val="ListParagraph"/>
+        <w:numPr>
+          <w:ilvl w:val="0"/>
+          <w:numId w:val="3"/>
+        </w:numPr>
+      </w:pPr>
+      <w:r>
+        <w:t>Use adaptative threshold:</w:t>
       </w:r>
     </w:p>
     <w:p>
@@ -378,17 +514,14 @@
         <w:pStyle w:val="ListParagraph"/>
         <w:numPr>
           <w:ilvl w:val="1"/>
-          <w:numId w:val="1"/>
-        </w:numPr>
-      </w:pPr>
-      <w:r>
-        <w:t>S</w:t>
-      </w:r>
-      <w:r>
-        <w:rPr>
-          <w:rFonts w:hint="eastAsia"/>
-        </w:rPr>
-        <w:t>mall rotations</w:t>
+          <w:numId w:val="3"/>
+        </w:numPr>
+      </w:pPr>
+      <w:r>
+        <w:rPr>
+          <w:lang w:val="es-CO"/>
+        </w:rPr>
+        <w:t>percentil por imagen</w:t>
       </w:r>
     </w:p>
     <w:p>
@@ -396,20 +529,75 @@
         <w:pStyle w:val="ListParagraph"/>
         <w:numPr>
           <w:ilvl w:val="1"/>
-          <w:numId w:val="1"/>
-        </w:numPr>
-        <w:rPr>
-          <w:rFonts w:hint="eastAsia"/>
-        </w:rPr>
-      </w:pPr>
-      <w:r>
-        <w:t>M</w:t>
-      </w:r>
-      <w:r>
-        <w:rPr>
-          <w:rFonts w:hint="eastAsia"/>
-        </w:rPr>
-        <w:t>ild shifts</w:t>
+          <w:numId w:val="3"/>
+        </w:numPr>
+        <w:rPr>
+          <w:lang w:val="es-CO"/>
+        </w:rPr>
+      </w:pPr>
+      <w:r>
+        <w:rPr>
+          <w:lang w:val="es-CO"/>
+        </w:rPr>
+        <w:t xml:space="preserve">Otsu sobre el </w:t>
+      </w:r>
+      <w:proofErr w:type="spellStart"/>
+      <w:r>
+        <w:rPr>
+          <w:lang w:val="es-CO"/>
+        </w:rPr>
+        <w:t>anomaly</w:t>
+      </w:r>
+      <w:proofErr w:type="spellEnd"/>
+      <w:r>
+        <w:rPr>
+          <w:lang w:val="es-CO"/>
+        </w:rPr>
+        <w:t xml:space="preserve"> </w:t>
+      </w:r>
+      <w:proofErr w:type="spellStart"/>
+      <w:r>
+        <w:rPr>
+          <w:lang w:val="es-CO"/>
+        </w:rPr>
+        <w:t>map</w:t>
+      </w:r>
+      <w:proofErr w:type="spellEnd"/>
+    </w:p>
+    <w:p>
+      <w:pPr>
+        <w:pStyle w:val="ListParagraph"/>
+        <w:numPr>
+          <w:ilvl w:val="1"/>
+          <w:numId w:val="3"/>
+        </w:numPr>
+        <w:rPr>
+          <w:lang w:val="es-CO"/>
+        </w:rPr>
+      </w:pPr>
+      <w:proofErr w:type="spellStart"/>
+      <w:r>
+        <w:rPr>
+          <w:lang w:val="es-CO"/>
+        </w:rPr>
+        <w:t>threshold</w:t>
+      </w:r>
+      <w:proofErr w:type="spellEnd"/>
+      <w:r>
+        <w:rPr>
+          <w:lang w:val="es-CO"/>
+        </w:rPr>
+        <w:t xml:space="preserve"> híbrido</w:t>
+      </w:r>
+    </w:p>
+    <w:p>
+      <w:pPr>
+        <w:rPr>
+          <w:rFonts w:hint="eastAsia"/>
+        </w:rPr>
+      </w:pPr>
+      <w:r>
+        <w:t>Depending on the image, some thresholds are working better or worse to detect just the anomalies.</w:t>
       </w:r>
     </w:p>
     <w:sectPr>
@@ -537,8 +725,216 @@
       </w:rPr>
     </w:lvl>
   </w:abstractNum>
+  <w:abstractNum w:abstractNumId="1" w15:restartNumberingAfterBreak="0">
+    <w:nsid w:val="3FDD3A03"/>
+    <w:multiLevelType w:val="hybridMultilevel"/>
+    <w:tmpl w:val="EDA45B24"/>
+    <w:lvl w:ilvl="0" w:tplc="240A000F">
+      <w:start w:val="1"/>
+      <w:numFmt w:val="decimal"/>
+      <w:lvlText w:val="%1."/>
+      <w:lvlJc w:val="left"/>
+      <w:pPr>
+        <w:ind w:left="720" w:hanging="360"/>
+      </w:pPr>
+      <w:rPr>
+        <w:rFonts w:hint="default"/>
+      </w:rPr>
+    </w:lvl>
+    <w:lvl w:ilvl="1" w:tplc="240A0019">
+      <w:start w:val="1"/>
+      <w:numFmt w:val="lowerLetter"/>
+      <w:lvlText w:val="%2."/>
+      <w:lvlJc w:val="left"/>
+      <w:pPr>
+        <w:ind w:left="1440" w:hanging="360"/>
+      </w:pPr>
+    </w:lvl>
+    <w:lvl w:ilvl="2" w:tplc="240A001B" w:tentative="1">
+      <w:start w:val="1"/>
+      <w:numFmt w:val="lowerRoman"/>
+      <w:lvlText w:val="%3."/>
+      <w:lvlJc w:val="right"/>
+      <w:pPr>
+        <w:ind w:left="2160" w:hanging="180"/>
+      </w:pPr>
+    </w:lvl>
+    <w:lvl w:ilvl="3" w:tplc="240A000F" w:tentative="1">
+      <w:start w:val="1"/>
+      <w:numFmt w:val="decimal"/>
+      <w:lvlText w:val="%4."/>
+      <w:lvlJc w:val="left"/>
+      <w:pPr>
+        <w:ind w:left="2880" w:hanging="360"/>
+      </w:pPr>
+    </w:lvl>
+    <w:lvl w:ilvl="4" w:tplc="240A0019" w:tentative="1">
+      <w:start w:val="1"/>
+      <w:numFmt w:val="lowerLetter"/>
+      <w:lvlText w:val="%5."/>
+      <w:lvlJc w:val="left"/>
+      <w:pPr>
+        <w:ind w:left="3600" w:hanging="360"/>
+      </w:pPr>
+    </w:lvl>
+    <w:lvl w:ilvl="5" w:tplc="240A001B" w:tentative="1">
+      <w:start w:val="1"/>
+      <w:numFmt w:val="lowerRoman"/>
+      <w:lvlText w:val="%6."/>
+      <w:lvlJc w:val="right"/>
+      <w:pPr>
+        <w:ind w:left="4320" w:hanging="180"/>
+      </w:pPr>
+    </w:lvl>
+    <w:lvl w:ilvl="6" w:tplc="240A000F" w:tentative="1">
+      <w:start w:val="1"/>
+      <w:numFmt w:val="decimal"/>
+      <w:lvlText w:val="%7."/>
+      <w:lvlJc w:val="left"/>
+      <w:pPr>
+        <w:ind w:left="5040" w:hanging="360"/>
+      </w:pPr>
+    </w:lvl>
+    <w:lvl w:ilvl="7" w:tplc="240A0019" w:tentative="1">
+      <w:start w:val="1"/>
+      <w:numFmt w:val="lowerLetter"/>
+      <w:lvlText w:val="%8."/>
+      <w:lvlJc w:val="left"/>
+      <w:pPr>
+        <w:ind w:left="5760" w:hanging="360"/>
+      </w:pPr>
+    </w:lvl>
+    <w:lvl w:ilvl="8" w:tplc="240A001B" w:tentative="1">
+      <w:start w:val="1"/>
+      <w:numFmt w:val="lowerRoman"/>
+      <w:lvlText w:val="%9."/>
+      <w:lvlJc w:val="right"/>
+      <w:pPr>
+        <w:ind w:left="6480" w:hanging="180"/>
+      </w:pPr>
+    </w:lvl>
+  </w:abstractNum>
+  <w:abstractNum w:abstractNumId="2" w15:restartNumberingAfterBreak="0">
+    <w:nsid w:val="704973A0"/>
+    <w:multiLevelType w:val="hybridMultilevel"/>
+    <w:tmpl w:val="3C8634F6"/>
+    <w:lvl w:ilvl="0" w:tplc="240A0001">
+      <w:start w:val="1"/>
+      <w:numFmt w:val="bullet"/>
+      <w:lvlText w:val=""/>
+      <w:lvlJc w:val="left"/>
+      <w:pPr>
+        <w:ind w:left="720" w:hanging="360"/>
+      </w:pPr>
+      <w:rPr>
+        <w:rFonts w:ascii="Symbol" w:hAnsi="Symbol" w:hint="default"/>
+      </w:rPr>
+    </w:lvl>
+    <w:lvl w:ilvl="1" w:tplc="240A0003" w:tentative="1">
+      <w:start w:val="1"/>
+      <w:numFmt w:val="bullet"/>
+      <w:lvlText w:val="o"/>
+      <w:lvlJc w:val="left"/>
+      <w:pPr>
+        <w:ind w:left="1440" w:hanging="360"/>
+      </w:pPr>
+      <w:rPr>
+        <w:rFonts w:ascii="Courier New" w:hAnsi="Courier New" w:cs="Courier New" w:hint="default"/>
+      </w:rPr>
+    </w:lvl>
+    <w:lvl w:ilvl="2" w:tplc="240A0005" w:tentative="1">
+      <w:start w:val="1"/>
+      <w:numFmt w:val="bullet"/>
+      <w:lvlText w:val=""/>
+      <w:lvlJc w:val="left"/>
+      <w:pPr>
+        <w:ind w:left="2160" w:hanging="360"/>
+      </w:pPr>
+      <w:rPr>
+        <w:rFonts w:ascii="Wingdings" w:hAnsi="Wingdings" w:hint="default"/>
+      </w:rPr>
+    </w:lvl>
+    <w:lvl w:ilvl="3" w:tplc="240A0001" w:tentative="1">
+      <w:start w:val="1"/>
+      <w:numFmt w:val="bullet"/>
+      <w:lvlText w:val=""/>
+      <w:lvlJc w:val="left"/>
+      <w:pPr>
+        <w:ind w:left="2880" w:hanging="360"/>
+      </w:pPr>
+      <w:rPr>
+        <w:rFonts w:ascii="Symbol" w:hAnsi="Symbol" w:hint="default"/>
+      </w:rPr>
+    </w:lvl>
+    <w:lvl w:ilvl="4" w:tplc="240A0003" w:tentative="1">
+      <w:start w:val="1"/>
+      <w:numFmt w:val="bullet"/>
+      <w:lvlText w:val="o"/>
+      <w:lvlJc w:val="left"/>
+      <w:pPr>
+        <w:ind w:left="3600" w:hanging="360"/>
+      </w:pPr>
+      <w:rPr>
+        <w:rFonts w:ascii="Courier New" w:hAnsi="Courier New" w:cs="Courier New" w:hint="default"/>
+      </w:rPr>
+    </w:lvl>
+    <w:lvl w:ilvl="5" w:tplc="240A0005" w:tentative="1">
+      <w:start w:val="1"/>
+      <w:numFmt w:val="bullet"/>
+      <w:lvlText w:val=""/>
+      <w:lvlJc w:val="left"/>
+      <w:pPr>
+        <w:ind w:left="4320" w:hanging="360"/>
+      </w:pPr>
+      <w:rPr>
+        <w:rFonts w:ascii="Wingdings" w:hAnsi="Wingdings" w:hint="default"/>
+      </w:rPr>
+    </w:lvl>
+    <w:lvl w:ilvl="6" w:tplc="240A0001" w:tentative="1">
+      <w:start w:val="1"/>
+      <w:numFmt w:val="bullet"/>
+      <w:lvlText w:val=""/>
+      <w:lvlJc w:val="left"/>
+      <w:pPr>
+        <w:ind w:left="5040" w:hanging="360"/>
+      </w:pPr>
+      <w:rPr>
+        <w:rFonts w:ascii="Symbol" w:hAnsi="Symbol" w:hint="default"/>
+      </w:rPr>
+    </w:lvl>
+    <w:lvl w:ilvl="7" w:tplc="240A0003" w:tentative="1">
+      <w:start w:val="1"/>
+      <w:numFmt w:val="bullet"/>
+      <w:lvlText w:val="o"/>
+      <w:lvlJc w:val="left"/>
+      <w:pPr>
+        <w:ind w:left="5760" w:hanging="360"/>
+      </w:pPr>
+      <w:rPr>
+        <w:rFonts w:ascii="Courier New" w:hAnsi="Courier New" w:cs="Courier New" w:hint="default"/>
+      </w:rPr>
+    </w:lvl>
+    <w:lvl w:ilvl="8" w:tplc="240A0005" w:tentative="1">
+      <w:start w:val="1"/>
+      <w:numFmt w:val="bullet"/>
+      <w:lvlText w:val=""/>
+      <w:lvlJc w:val="left"/>
+      <w:pPr>
+        <w:ind w:left="6480" w:hanging="360"/>
+      </w:pPr>
+      <w:rPr>
+        <w:rFonts w:ascii="Wingdings" w:hAnsi="Wingdings" w:hint="default"/>
+      </w:rPr>
+    </w:lvl>
+  </w:abstractNum>
   <w:num w:numId="1" w16cid:durableId="961496453">
     <w:abstractNumId w:val="0"/>
+  </w:num>
+  <w:num w:numId="2" w16cid:durableId="736587739">
+    <w:abstractNumId w:val="2"/>
+  </w:num>
+  <w:num w:numId="3" w16cid:durableId="2086225590">
+    <w:abstractNumId w:val="1"/>
   </w:num>
 </w:numbering>
 </file>
@@ -1146,7 +1542,6 @@
   <w:style w:type="character" w:default="1" w:styleId="DefaultParagraphFont">
     <w:name w:val="Default Paragraph Font"/>
     <w:uiPriority w:val="1"/>
-    <w:semiHidden/>
     <w:unhideWhenUsed/>
   </w:style>
   <w:style w:type="table" w:default="1" w:styleId="TableNormal">

</xml_diff>

<commit_message>
Doc update according to changes on code
</commit_message>
<xml_diff>
--- a/.notes/Improvements for the dae.docx
+++ b/.notes/Improvements for the dae.docx
@@ -156,22 +156,33 @@
           <w:ilvl w:val="0"/>
           <w:numId w:val="1"/>
         </w:numPr>
-      </w:pPr>
-      <w:r>
+        <w:rPr>
+          <w:highlight w:val="green"/>
+        </w:rPr>
+      </w:pPr>
+      <w:r>
+        <w:rPr>
+          <w:highlight w:val="green"/>
+        </w:rPr>
         <w:t>Enhance</w:t>
       </w:r>
       <w:r>
         <w:rPr>
           <w:rFonts w:hint="eastAsia"/>
+          <w:highlight w:val="green"/>
         </w:rPr>
         <w:t xml:space="preserve"> the input images by </w:t>
       </w:r>
       <w:r>
+        <w:rPr>
+          <w:highlight w:val="green"/>
+        </w:rPr>
         <w:t>improving</w:t>
       </w:r>
       <w:r>
         <w:rPr>
           <w:rFonts w:hint="eastAsia"/>
+          <w:highlight w:val="green"/>
         </w:rPr>
         <w:t xml:space="preserve"> the bounding boxes merging function.</w:t>
       </w:r>
@@ -442,6 +453,9 @@
       </w:r>
     </w:p>
     <w:p>
+      <w:pPr>
+        <w:ind w:firstLine="360"/>
+      </w:pPr>
       <w:r>
         <w:t>Use the bounding boxes of the segmentation part, since everything marked out of the box corresponds to the padding. Given that, the weight of the pixels outside the bounding box (the padding) could be set to 0. This means that the model won’</w:t>
       </w:r>
@@ -478,7 +492,44 @@
         </w:numPr>
       </w:pPr>
       <w:r>
-        <w:t>Increase the closing/dilatation of the binary anomaly map.</w:t>
+        <w:t>Loss function:</w:t>
+      </w:r>
+    </w:p>
+    <w:p>
+      <w:pPr>
+        <w:pStyle w:val="ListParagraph"/>
+        <w:numPr>
+          <w:ilvl w:val="0"/>
+          <w:numId w:val="4"/>
+        </w:numPr>
+      </w:pPr>
+      <w:r>
+        <w:t>Structural error SSIM</w:t>
+      </w:r>
+    </w:p>
+    <w:p>
+      <w:pPr>
+        <w:pStyle w:val="ListParagraph"/>
+        <w:numPr>
+          <w:ilvl w:val="0"/>
+          <w:numId w:val="4"/>
+        </w:numPr>
+      </w:pPr>
+      <w:r>
+        <w:t>More attention to the error in the colors.</w:t>
+      </w:r>
+    </w:p>
+    <w:p>
+      <w:pPr>
+        <w:pStyle w:val="ListParagraph"/>
+        <w:numPr>
+          <w:ilvl w:val="0"/>
+          <w:numId w:val="4"/>
+        </w:numPr>
+        <w:spacing w:line="480" w:lineRule="auto"/>
+      </w:pPr>
+      <w:r>
+        <w:t>Blur the map before thresholding.</w:t>
       </w:r>
     </w:p>
     <w:p>
@@ -488,13 +539,95 @@
           <w:ilvl w:val="0"/>
           <w:numId w:val="3"/>
         </w:numPr>
-        <w:spacing w:line="480" w:lineRule="auto"/>
-      </w:pPr>
-      <w:r>
-        <w:t>Add a small dilatation to the boxes surrounding the anomalies</w:t>
-      </w:r>
-      <w:r>
-        <w:t>.</w:t>
+      </w:pPr>
+      <w:r>
+        <w:t>Use adaptative threshold:</w:t>
+      </w:r>
+    </w:p>
+    <w:p>
+      <w:pPr>
+        <w:pStyle w:val="ListParagraph"/>
+        <w:numPr>
+          <w:ilvl w:val="1"/>
+          <w:numId w:val="5"/>
+        </w:numPr>
+      </w:pPr>
+      <w:r>
+        <w:rPr>
+          <w:lang w:val="es-CO"/>
+        </w:rPr>
+        <w:t>percentil por imagen</w:t>
+      </w:r>
+    </w:p>
+    <w:p>
+      <w:pPr>
+        <w:pStyle w:val="ListParagraph"/>
+        <w:numPr>
+          <w:ilvl w:val="1"/>
+          <w:numId w:val="5"/>
+        </w:numPr>
+        <w:rPr>
+          <w:lang w:val="es-CO"/>
+        </w:rPr>
+      </w:pPr>
+      <w:r>
+        <w:rPr>
+          <w:lang w:val="es-CO"/>
+        </w:rPr>
+        <w:t xml:space="preserve">Otsu sobre el </w:t>
+      </w:r>
+      <w:proofErr w:type="spellStart"/>
+      <w:r>
+        <w:rPr>
+          <w:lang w:val="es-CO"/>
+        </w:rPr>
+        <w:t>anomaly</w:t>
+      </w:r>
+      <w:proofErr w:type="spellEnd"/>
+      <w:r>
+        <w:rPr>
+          <w:lang w:val="es-CO"/>
+        </w:rPr>
+        <w:t xml:space="preserve"> </w:t>
+      </w:r>
+      <w:proofErr w:type="spellStart"/>
+      <w:r>
+        <w:rPr>
+          <w:lang w:val="es-CO"/>
+        </w:rPr>
+        <w:t>map</w:t>
+      </w:r>
+      <w:proofErr w:type="spellEnd"/>
+    </w:p>
+    <w:p>
+      <w:pPr>
+        <w:pStyle w:val="ListParagraph"/>
+        <w:numPr>
+          <w:ilvl w:val="1"/>
+          <w:numId w:val="5"/>
+        </w:numPr>
+        <w:rPr>
+          <w:lang w:val="es-CO"/>
+        </w:rPr>
+      </w:pPr>
+      <w:proofErr w:type="spellStart"/>
+      <w:r>
+        <w:rPr>
+          <w:lang w:val="es-CO"/>
+        </w:rPr>
+        <w:t>threshold</w:t>
+      </w:r>
+      <w:proofErr w:type="spellEnd"/>
+      <w:r>
+        <w:rPr>
+          <w:lang w:val="es-CO"/>
+        </w:rPr>
+        <w:t xml:space="preserve"> híbrido</w:t>
+      </w:r>
+    </w:p>
+    <w:p>
+      <w:r>
+        <w:t>Depending on the image, some thresholds are working better or worse to detect just the anomalies.</w:t>
       </w:r>
     </w:p>
     <w:p>
@@ -504,100 +637,26 @@
           <w:ilvl w:val="0"/>
           <w:numId w:val="3"/>
         </w:numPr>
-      </w:pPr>
-      <w:r>
-        <w:t>Use adaptative threshold:</w:t>
-      </w:r>
-    </w:p>
-    <w:p>
-      <w:pPr>
-        <w:pStyle w:val="ListParagraph"/>
-        <w:numPr>
-          <w:ilvl w:val="1"/>
+        <w:spacing w:line="480" w:lineRule="auto"/>
+      </w:pPr>
+      <w:r>
+        <w:t>Increase the closing/dilatation of the binary anomaly map.</w:t>
+      </w:r>
+    </w:p>
+    <w:p>
+      <w:pPr>
+        <w:pStyle w:val="ListParagraph"/>
+        <w:numPr>
+          <w:ilvl w:val="0"/>
           <w:numId w:val="3"/>
         </w:numPr>
-      </w:pPr>
-      <w:r>
-        <w:rPr>
-          <w:lang w:val="es-CO"/>
-        </w:rPr>
-        <w:t>percentil por imagen</w:t>
-      </w:r>
-    </w:p>
-    <w:p>
-      <w:pPr>
-        <w:pStyle w:val="ListParagraph"/>
-        <w:numPr>
-          <w:ilvl w:val="1"/>
-          <w:numId w:val="3"/>
-        </w:numPr>
-        <w:rPr>
-          <w:lang w:val="es-CO"/>
-        </w:rPr>
-      </w:pPr>
-      <w:r>
-        <w:rPr>
-          <w:lang w:val="es-CO"/>
-        </w:rPr>
-        <w:t xml:space="preserve">Otsu sobre el </w:t>
-      </w:r>
-      <w:proofErr w:type="spellStart"/>
-      <w:r>
-        <w:rPr>
-          <w:lang w:val="es-CO"/>
-        </w:rPr>
-        <w:t>anomaly</w:t>
-      </w:r>
-      <w:proofErr w:type="spellEnd"/>
-      <w:r>
-        <w:rPr>
-          <w:lang w:val="es-CO"/>
-        </w:rPr>
-        <w:t xml:space="preserve"> </w:t>
-      </w:r>
-      <w:proofErr w:type="spellStart"/>
-      <w:r>
-        <w:rPr>
-          <w:lang w:val="es-CO"/>
-        </w:rPr>
-        <w:t>map</w:t>
-      </w:r>
-      <w:proofErr w:type="spellEnd"/>
-    </w:p>
-    <w:p>
-      <w:pPr>
-        <w:pStyle w:val="ListParagraph"/>
-        <w:numPr>
-          <w:ilvl w:val="1"/>
-          <w:numId w:val="3"/>
-        </w:numPr>
-        <w:rPr>
-          <w:lang w:val="es-CO"/>
-        </w:rPr>
-      </w:pPr>
-      <w:proofErr w:type="spellStart"/>
-      <w:r>
-        <w:rPr>
-          <w:lang w:val="es-CO"/>
-        </w:rPr>
-        <w:t>threshold</w:t>
-      </w:r>
-      <w:proofErr w:type="spellEnd"/>
-      <w:r>
-        <w:rPr>
-          <w:lang w:val="es-CO"/>
-        </w:rPr>
-        <w:t xml:space="preserve"> híbrido</w:t>
-      </w:r>
-    </w:p>
-    <w:p>
-      <w:pPr>
-        <w:rPr>
-          <w:rFonts w:hint="eastAsia"/>
-        </w:rPr>
-      </w:pPr>
-      <w:r>
-        <w:t>Depending on the image, some thresholds are working better or worse to detect just the anomalies.</w:t>
+        <w:spacing w:line="480" w:lineRule="auto"/>
+      </w:pPr>
+      <w:r>
+        <w:t>Add a small dilatation to the boxes surrounding the anomalies</w:t>
+      </w:r>
+      <w:r>
+        <w:t>.</w:t>
       </w:r>
     </w:p>
     <w:sectPr>
@@ -728,14 +787,14 @@
   <w:abstractNum w:abstractNumId="1" w15:restartNumberingAfterBreak="0">
     <w:nsid w:val="3FDD3A03"/>
     <w:multiLevelType w:val="hybridMultilevel"/>
-    <w:tmpl w:val="EDA45B24"/>
+    <w:tmpl w:val="E22C58F4"/>
     <w:lvl w:ilvl="0" w:tplc="240A000F">
       <w:start w:val="1"/>
       <w:numFmt w:val="decimal"/>
       <w:lvlText w:val="%1."/>
       <w:lvlJc w:val="left"/>
       <w:pPr>
-        <w:ind w:left="720" w:hanging="360"/>
+        <w:ind w:left="360" w:hanging="360"/>
       </w:pPr>
       <w:rPr>
         <w:rFonts w:hint="default"/>
@@ -747,7 +806,7 @@
       <w:lvlText w:val="%2."/>
       <w:lvlJc w:val="left"/>
       <w:pPr>
-        <w:ind w:left="1440" w:hanging="360"/>
+        <w:ind w:left="1080" w:hanging="360"/>
       </w:pPr>
     </w:lvl>
     <w:lvl w:ilvl="2" w:tplc="240A001B" w:tentative="1">
@@ -756,7 +815,7 @@
       <w:lvlText w:val="%3."/>
       <w:lvlJc w:val="right"/>
       <w:pPr>
-        <w:ind w:left="2160" w:hanging="180"/>
+        <w:ind w:left="1800" w:hanging="180"/>
       </w:pPr>
     </w:lvl>
     <w:lvl w:ilvl="3" w:tplc="240A000F" w:tentative="1">
@@ -765,7 +824,7 @@
       <w:lvlText w:val="%4."/>
       <w:lvlJc w:val="left"/>
       <w:pPr>
-        <w:ind w:left="2880" w:hanging="360"/>
+        <w:ind w:left="2520" w:hanging="360"/>
       </w:pPr>
     </w:lvl>
     <w:lvl w:ilvl="4" w:tplc="240A0019" w:tentative="1">
@@ -774,7 +833,7 @@
       <w:lvlText w:val="%5."/>
       <w:lvlJc w:val="left"/>
       <w:pPr>
-        <w:ind w:left="3600" w:hanging="360"/>
+        <w:ind w:left="3240" w:hanging="360"/>
       </w:pPr>
     </w:lvl>
     <w:lvl w:ilvl="5" w:tplc="240A001B" w:tentative="1">
@@ -783,7 +842,7 @@
       <w:lvlText w:val="%6."/>
       <w:lvlJc w:val="right"/>
       <w:pPr>
-        <w:ind w:left="4320" w:hanging="180"/>
+        <w:ind w:left="3960" w:hanging="180"/>
       </w:pPr>
     </w:lvl>
     <w:lvl w:ilvl="6" w:tplc="240A000F" w:tentative="1">
@@ -792,7 +851,7 @@
       <w:lvlText w:val="%7."/>
       <w:lvlJc w:val="left"/>
       <w:pPr>
-        <w:ind w:left="5040" w:hanging="360"/>
+        <w:ind w:left="4680" w:hanging="360"/>
       </w:pPr>
     </w:lvl>
     <w:lvl w:ilvl="7" w:tplc="240A0019" w:tentative="1">
@@ -801,7 +860,7 @@
       <w:lvlText w:val="%8."/>
       <w:lvlJc w:val="left"/>
       <w:pPr>
-        <w:ind w:left="5760" w:hanging="360"/>
+        <w:ind w:left="5400" w:hanging="360"/>
       </w:pPr>
     </w:lvl>
     <w:lvl w:ilvl="8" w:tplc="240A001B" w:tentative="1">
@@ -810,11 +869,124 @@
       <w:lvlText w:val="%9."/>
       <w:lvlJc w:val="right"/>
       <w:pPr>
-        <w:ind w:left="6480" w:hanging="180"/>
+        <w:ind w:left="6120" w:hanging="180"/>
       </w:pPr>
     </w:lvl>
   </w:abstractNum>
   <w:abstractNum w:abstractNumId="2" w15:restartNumberingAfterBreak="0">
+    <w:nsid w:val="6B8E71BA"/>
+    <w:multiLevelType w:val="hybridMultilevel"/>
+    <w:tmpl w:val="6F9E6D7C"/>
+    <w:lvl w:ilvl="0" w:tplc="240A0001">
+      <w:start w:val="1"/>
+      <w:numFmt w:val="bullet"/>
+      <w:lvlText w:val=""/>
+      <w:lvlJc w:val="left"/>
+      <w:pPr>
+        <w:ind w:left="720" w:hanging="360"/>
+      </w:pPr>
+      <w:rPr>
+        <w:rFonts w:ascii="Symbol" w:hAnsi="Symbol" w:hint="default"/>
+      </w:rPr>
+    </w:lvl>
+    <w:lvl w:ilvl="1" w:tplc="240A0003" w:tentative="1">
+      <w:start w:val="1"/>
+      <w:numFmt w:val="bullet"/>
+      <w:lvlText w:val="o"/>
+      <w:lvlJc w:val="left"/>
+      <w:pPr>
+        <w:ind w:left="1440" w:hanging="360"/>
+      </w:pPr>
+      <w:rPr>
+        <w:rFonts w:ascii="Courier New" w:hAnsi="Courier New" w:cs="Courier New" w:hint="default"/>
+      </w:rPr>
+    </w:lvl>
+    <w:lvl w:ilvl="2" w:tplc="240A0005" w:tentative="1">
+      <w:start w:val="1"/>
+      <w:numFmt w:val="bullet"/>
+      <w:lvlText w:val=""/>
+      <w:lvlJc w:val="left"/>
+      <w:pPr>
+        <w:ind w:left="2160" w:hanging="360"/>
+      </w:pPr>
+      <w:rPr>
+        <w:rFonts w:ascii="Wingdings" w:hAnsi="Wingdings" w:hint="default"/>
+      </w:rPr>
+    </w:lvl>
+    <w:lvl w:ilvl="3" w:tplc="240A0001" w:tentative="1">
+      <w:start w:val="1"/>
+      <w:numFmt w:val="bullet"/>
+      <w:lvlText w:val=""/>
+      <w:lvlJc w:val="left"/>
+      <w:pPr>
+        <w:ind w:left="2880" w:hanging="360"/>
+      </w:pPr>
+      <w:rPr>
+        <w:rFonts w:ascii="Symbol" w:hAnsi="Symbol" w:hint="default"/>
+      </w:rPr>
+    </w:lvl>
+    <w:lvl w:ilvl="4" w:tplc="240A0003" w:tentative="1">
+      <w:start w:val="1"/>
+      <w:numFmt w:val="bullet"/>
+      <w:lvlText w:val="o"/>
+      <w:lvlJc w:val="left"/>
+      <w:pPr>
+        <w:ind w:left="3600" w:hanging="360"/>
+      </w:pPr>
+      <w:rPr>
+        <w:rFonts w:ascii="Courier New" w:hAnsi="Courier New" w:cs="Courier New" w:hint="default"/>
+      </w:rPr>
+    </w:lvl>
+    <w:lvl w:ilvl="5" w:tplc="240A0005" w:tentative="1">
+      <w:start w:val="1"/>
+      <w:numFmt w:val="bullet"/>
+      <w:lvlText w:val=""/>
+      <w:lvlJc w:val="left"/>
+      <w:pPr>
+        <w:ind w:left="4320" w:hanging="360"/>
+      </w:pPr>
+      <w:rPr>
+        <w:rFonts w:ascii="Wingdings" w:hAnsi="Wingdings" w:hint="default"/>
+      </w:rPr>
+    </w:lvl>
+    <w:lvl w:ilvl="6" w:tplc="240A0001" w:tentative="1">
+      <w:start w:val="1"/>
+      <w:numFmt w:val="bullet"/>
+      <w:lvlText w:val=""/>
+      <w:lvlJc w:val="left"/>
+      <w:pPr>
+        <w:ind w:left="5040" w:hanging="360"/>
+      </w:pPr>
+      <w:rPr>
+        <w:rFonts w:ascii="Symbol" w:hAnsi="Symbol" w:hint="default"/>
+      </w:rPr>
+    </w:lvl>
+    <w:lvl w:ilvl="7" w:tplc="240A0003" w:tentative="1">
+      <w:start w:val="1"/>
+      <w:numFmt w:val="bullet"/>
+      <w:lvlText w:val="o"/>
+      <w:lvlJc w:val="left"/>
+      <w:pPr>
+        <w:ind w:left="5760" w:hanging="360"/>
+      </w:pPr>
+      <w:rPr>
+        <w:rFonts w:ascii="Courier New" w:hAnsi="Courier New" w:cs="Courier New" w:hint="default"/>
+      </w:rPr>
+    </w:lvl>
+    <w:lvl w:ilvl="8" w:tplc="240A0005" w:tentative="1">
+      <w:start w:val="1"/>
+      <w:numFmt w:val="bullet"/>
+      <w:lvlText w:val=""/>
+      <w:lvlJc w:val="left"/>
+      <w:pPr>
+        <w:ind w:left="6480" w:hanging="360"/>
+      </w:pPr>
+      <w:rPr>
+        <w:rFonts w:ascii="Wingdings" w:hAnsi="Wingdings" w:hint="default"/>
+      </w:rPr>
+    </w:lvl>
+  </w:abstractNum>
+  <w:abstractNum w:abstractNumId="3" w15:restartNumberingAfterBreak="0">
     <w:nsid w:val="704973A0"/>
     <w:multiLevelType w:val="hybridMultilevel"/>
     <w:tmpl w:val="3C8634F6"/>
@@ -925,16 +1097,114 @@
       <w:rPr>
         <w:rFonts w:ascii="Wingdings" w:hAnsi="Wingdings" w:hint="default"/>
       </w:rPr>
+    </w:lvl>
+  </w:abstractNum>
+  <w:abstractNum w:abstractNumId="4" w15:restartNumberingAfterBreak="0">
+    <w:nsid w:val="7BC75866"/>
+    <w:multiLevelType w:val="hybridMultilevel"/>
+    <w:tmpl w:val="BE6E26D4"/>
+    <w:lvl w:ilvl="0" w:tplc="FFFFFFFF">
+      <w:start w:val="1"/>
+      <w:numFmt w:val="decimal"/>
+      <w:lvlText w:val="%1."/>
+      <w:lvlJc w:val="left"/>
+      <w:pPr>
+        <w:ind w:left="360" w:hanging="360"/>
+      </w:pPr>
+      <w:rPr>
+        <w:rFonts w:hint="default"/>
+      </w:rPr>
+    </w:lvl>
+    <w:lvl w:ilvl="1" w:tplc="240A0001">
+      <w:start w:val="1"/>
+      <w:numFmt w:val="bullet"/>
+      <w:lvlText w:val=""/>
+      <w:lvlJc w:val="left"/>
+      <w:pPr>
+        <w:ind w:left="720" w:hanging="360"/>
+      </w:pPr>
+      <w:rPr>
+        <w:rFonts w:ascii="Symbol" w:hAnsi="Symbol" w:hint="default"/>
+      </w:rPr>
+    </w:lvl>
+    <w:lvl w:ilvl="2" w:tplc="FFFFFFFF" w:tentative="1">
+      <w:start w:val="1"/>
+      <w:numFmt w:val="lowerRoman"/>
+      <w:lvlText w:val="%3."/>
+      <w:lvlJc w:val="right"/>
+      <w:pPr>
+        <w:ind w:left="1800" w:hanging="180"/>
+      </w:pPr>
+    </w:lvl>
+    <w:lvl w:ilvl="3" w:tplc="FFFFFFFF" w:tentative="1">
+      <w:start w:val="1"/>
+      <w:numFmt w:val="decimal"/>
+      <w:lvlText w:val="%4."/>
+      <w:lvlJc w:val="left"/>
+      <w:pPr>
+        <w:ind w:left="2520" w:hanging="360"/>
+      </w:pPr>
+    </w:lvl>
+    <w:lvl w:ilvl="4" w:tplc="FFFFFFFF" w:tentative="1">
+      <w:start w:val="1"/>
+      <w:numFmt w:val="lowerLetter"/>
+      <w:lvlText w:val="%5."/>
+      <w:lvlJc w:val="left"/>
+      <w:pPr>
+        <w:ind w:left="3240" w:hanging="360"/>
+      </w:pPr>
+    </w:lvl>
+    <w:lvl w:ilvl="5" w:tplc="FFFFFFFF" w:tentative="1">
+      <w:start w:val="1"/>
+      <w:numFmt w:val="lowerRoman"/>
+      <w:lvlText w:val="%6."/>
+      <w:lvlJc w:val="right"/>
+      <w:pPr>
+        <w:ind w:left="3960" w:hanging="180"/>
+      </w:pPr>
+    </w:lvl>
+    <w:lvl w:ilvl="6" w:tplc="FFFFFFFF" w:tentative="1">
+      <w:start w:val="1"/>
+      <w:numFmt w:val="decimal"/>
+      <w:lvlText w:val="%7."/>
+      <w:lvlJc w:val="left"/>
+      <w:pPr>
+        <w:ind w:left="4680" w:hanging="360"/>
+      </w:pPr>
+    </w:lvl>
+    <w:lvl w:ilvl="7" w:tplc="FFFFFFFF" w:tentative="1">
+      <w:start w:val="1"/>
+      <w:numFmt w:val="lowerLetter"/>
+      <w:lvlText w:val="%8."/>
+      <w:lvlJc w:val="left"/>
+      <w:pPr>
+        <w:ind w:left="5400" w:hanging="360"/>
+      </w:pPr>
+    </w:lvl>
+    <w:lvl w:ilvl="8" w:tplc="FFFFFFFF" w:tentative="1">
+      <w:start w:val="1"/>
+      <w:numFmt w:val="lowerRoman"/>
+      <w:lvlText w:val="%9."/>
+      <w:lvlJc w:val="right"/>
+      <w:pPr>
+        <w:ind w:left="6120" w:hanging="180"/>
+      </w:pPr>
     </w:lvl>
   </w:abstractNum>
   <w:num w:numId="1" w16cid:durableId="961496453">
     <w:abstractNumId w:val="0"/>
   </w:num>
   <w:num w:numId="2" w16cid:durableId="736587739">
-    <w:abstractNumId w:val="2"/>
+    <w:abstractNumId w:val="3"/>
   </w:num>
   <w:num w:numId="3" w16cid:durableId="2086225590">
     <w:abstractNumId w:val="1"/>
+  </w:num>
+  <w:num w:numId="4" w16cid:durableId="488788683">
+    <w:abstractNumId w:val="2"/>
+  </w:num>
+  <w:num w:numId="5" w16cid:durableId="75782802">
+    <w:abstractNumId w:val="4"/>
   </w:num>
 </w:numbering>
 </file>

</xml_diff>

<commit_message>
One more improvement implemented and checked
</commit_message>
<xml_diff>
--- a/.notes/Improvements for the dae.docx
+++ b/.notes/Improvements for the dae.docx
@@ -42,17 +42,27 @@
           <w:ilvl w:val="0"/>
           <w:numId w:val="1"/>
         </w:numPr>
-      </w:pPr>
-      <w:r>
+        <w:rPr>
+          <w:highlight w:val="green"/>
+        </w:rPr>
+      </w:pPr>
+      <w:r>
+        <w:rPr>
+          <w:highlight w:val="green"/>
+        </w:rPr>
         <w:t>I</w:t>
       </w:r>
       <w:r>
         <w:rPr>
           <w:rFonts w:hint="eastAsia"/>
+          <w:highlight w:val="green"/>
         </w:rPr>
         <w:t>mplement masking over the object</w:t>
       </w:r>
       <w:r>
+        <w:rPr>
+          <w:highlight w:val="green"/>
+        </w:rPr>
         <w:t xml:space="preserve"> / useful region</w:t>
       </w:r>
     </w:p>
@@ -63,22 +73,38 @@
           <w:ilvl w:val="1"/>
           <w:numId w:val="1"/>
         </w:numPr>
-      </w:pPr>
-      <w:r>
+        <w:rPr>
+          <w:highlight w:val="green"/>
+        </w:rPr>
+      </w:pPr>
+      <w:r>
+        <w:rPr>
+          <w:highlight w:val="green"/>
+        </w:rPr>
         <w:t xml:space="preserve">This makes </w:t>
       </w:r>
       <w:r>
+        <w:rPr>
+          <w:highlight w:val="green"/>
+        </w:rPr>
         <w:t xml:space="preserve">the padding </w:t>
       </w:r>
       <w:r>
+        <w:rPr>
+          <w:highlight w:val="green"/>
+        </w:rPr>
         <w:t xml:space="preserve">to have </w:t>
       </w:r>
       <w:r>
+        <w:rPr>
+          <w:highlight w:val="green"/>
+        </w:rPr>
         <w:t>less weight on the loss</w:t>
       </w:r>
       <w:r>
         <w:rPr>
           <w:rFonts w:hint="eastAsia"/>
+          <w:highlight w:val="green"/>
         </w:rPr>
         <w:t>.</w:t>
       </w:r>
@@ -643,13 +669,7 @@
         <w:t xml:space="preserve">Make the kernels and the </w:t>
       </w:r>
       <w:r>
-        <w:t xml:space="preserve">area filter </w:t>
-      </w:r>
-      <w:r>
-        <w:t>dependent</w:t>
-      </w:r>
-      <w:r>
-        <w:t xml:space="preserve"> on the image size (see TODO’s)</w:t>
+        <w:t>area filter dependent on the image size (see TODO’s)</w:t>
       </w:r>
     </w:p>
     <w:p>

</xml_diff>